<commit_message>
Add temporary files for Yang et al. (2023) and Individual Annotations
</commit_message>
<xml_diff>
--- a/main/04_data_extraction/papers_readed/3. Yang et al. (2023).docx
+++ b/main/04_data_extraction/papers_readed/3. Yang et al. (2023).docx
@@ -734,31 +734,7 @@
           <w:shd w:val="clear" w:color="auto" w:fill="FFFFFF"/>
           <w:lang w:val="en-US"/>
         </w:rPr>
-        <w:t xml:space="preserve">It was developed to address the mesh-dependent shortcoming of classical neural networks by creating a single deep learning model that can be applied to different </w:t>
-      </w:r>
-      <w:proofErr w:type="spellStart"/>
-      <w:r>
-        <w:rPr>
-          <w:rFonts w:ascii="Times New Roman" w:hAnsi="Times New Roman" w:cs="Times New Roman"/>
-          <w:color w:val="333333"/>
-          <w:sz w:val="20"/>
-          <w:szCs w:val="20"/>
-          <w:shd w:val="clear" w:color="auto" w:fill="FFFFFF"/>
-          <w:lang w:val="en-US"/>
-        </w:rPr>
-        <w:t>discretizations</w:t>
-      </w:r>
-      <w:proofErr w:type="spellEnd"/>
-      <w:r>
-        <w:rPr>
-          <w:rFonts w:ascii="Times New Roman" w:hAnsi="Times New Roman" w:cs="Times New Roman"/>
-          <w:color w:val="333333"/>
-          <w:sz w:val="20"/>
-          <w:szCs w:val="20"/>
-          <w:shd w:val="clear" w:color="auto" w:fill="FFFFFF"/>
-          <w:lang w:val="en-US"/>
-        </w:rPr>
-        <w:t>.</w:t>
+        <w:t>It was developed to address the mesh-dependent shortcoming of classical neural networks by creating a single deep learning model that can be applied to different discretizations.</w:t>
       </w:r>
     </w:p>
     <w:p>
@@ -782,31 +758,7 @@
           <w:shd w:val="clear" w:color="auto" w:fill="FFFFFF"/>
           <w:lang w:val="en-US"/>
         </w:rPr>
-        <w:t xml:space="preserve">2. Global synthetic seismograms using a 2-D </w:t>
-      </w:r>
-      <w:proofErr w:type="spellStart"/>
-      <w:r>
-        <w:rPr>
-          <w:rFonts w:ascii="Times New Roman" w:hAnsi="Times New Roman" w:cs="Times New Roman"/>
-          <w:color w:val="333333"/>
-          <w:sz w:val="20"/>
-          <w:szCs w:val="20"/>
-          <w:shd w:val="clear" w:color="auto" w:fill="FFFFFF"/>
-          <w:lang w:val="en-US"/>
-        </w:rPr>
-        <w:t>finitedifference</w:t>
-      </w:r>
-      <w:proofErr w:type="spellEnd"/>
-      <w:r>
-        <w:rPr>
-          <w:rFonts w:ascii="Times New Roman" w:hAnsi="Times New Roman" w:cs="Times New Roman"/>
-          <w:color w:val="333333"/>
-          <w:sz w:val="20"/>
-          <w:szCs w:val="20"/>
-          <w:shd w:val="clear" w:color="auto" w:fill="FFFFFF"/>
-          <w:lang w:val="en-US"/>
-        </w:rPr>
-        <w:t xml:space="preserve"> method</w:t>
+        <w:t>2. Global synthetic seismograms using a 2-D finitedifference method</w:t>
       </w:r>
     </w:p>
     <w:p>
@@ -1095,31 +1047,7 @@
           <w:shd w:val="clear" w:color="auto" w:fill="FFFFFF"/>
           <w:lang w:val="en-US"/>
         </w:rPr>
-        <w:t xml:space="preserve">was developed to address the mesh-dependent shortcoming of classical neural networks by creating a single deep learning model that can be applied to different </w:t>
-      </w:r>
-      <w:proofErr w:type="spellStart"/>
-      <w:r>
-        <w:rPr>
-          <w:rFonts w:ascii="Times New Roman" w:hAnsi="Times New Roman" w:cs="Times New Roman"/>
-          <w:color w:val="333333"/>
-          <w:sz w:val="20"/>
-          <w:szCs w:val="20"/>
-          <w:shd w:val="clear" w:color="auto" w:fill="FFFFFF"/>
-          <w:lang w:val="en-US"/>
-        </w:rPr>
-        <w:t>discretizations</w:t>
-      </w:r>
-      <w:proofErr w:type="spellEnd"/>
-      <w:r>
-        <w:rPr>
-          <w:rFonts w:ascii="Times New Roman" w:hAnsi="Times New Roman" w:cs="Times New Roman"/>
-          <w:color w:val="333333"/>
-          <w:sz w:val="20"/>
-          <w:szCs w:val="20"/>
-          <w:shd w:val="clear" w:color="auto" w:fill="FFFFFF"/>
-          <w:lang w:val="en-US"/>
-        </w:rPr>
-        <w:t>.</w:t>
+        <w:t>was developed to address the mesh-dependent shortcoming of classical neural networks by creating a single deep learning model that can be applied to different discretizations.</w:t>
       </w:r>
     </w:p>
     <w:p>
@@ -1173,35 +1101,7 @@
           <w:shd w:val="clear" w:color="auto" w:fill="FFFFFF"/>
           <w:lang w:val="en-US"/>
         </w:rPr>
-        <w:t xml:space="preserve">  - ML framework (</w:t>
-      </w:r>
-      <w:proofErr w:type="spellStart"/>
-      <w:r>
-        <w:rPr>
-          <w:rFonts w:ascii="Times New Roman" w:hAnsi="Times New Roman" w:cs="Times New Roman"/>
-          <w:b/>
-          <w:bCs/>
-          <w:color w:val="333333"/>
-          <w:sz w:val="20"/>
-          <w:szCs w:val="20"/>
-          <w:shd w:val="clear" w:color="auto" w:fill="FFFFFF"/>
-          <w:lang w:val="en-US"/>
-        </w:rPr>
-        <w:t>PyTorch</w:t>
-      </w:r>
-      <w:proofErr w:type="spellEnd"/>
-      <w:r>
-        <w:rPr>
-          <w:rFonts w:ascii="Times New Roman" w:hAnsi="Times New Roman" w:cs="Times New Roman"/>
-          <w:b/>
-          <w:bCs/>
-          <w:color w:val="333333"/>
-          <w:sz w:val="20"/>
-          <w:szCs w:val="20"/>
-          <w:shd w:val="clear" w:color="auto" w:fill="FFFFFF"/>
-          <w:lang w:val="en-US"/>
-        </w:rPr>
-        <w:t>, TensorFlow, JAX, etc.):</w:t>
+        <w:t xml:space="preserve">  - ML framework (PyTorch, TensorFlow, JAX, etc.):</w:t>
       </w:r>
     </w:p>
     <w:p>
@@ -1446,23 +1346,8 @@
           <w:shd w:val="clear" w:color="auto" w:fill="FFFFFF"/>
           <w:lang w:val="en-US"/>
         </w:rPr>
-        <w:t xml:space="preserve">  - </w:t>
-      </w:r>
-      <w:proofErr w:type="spellStart"/>
-      <w:r>
-        <w:rPr>
-          <w:rFonts w:ascii="Times New Roman" w:hAnsi="Times New Roman" w:cs="Times New Roman"/>
-          <w:b/>
-          <w:bCs/>
-          <w:color w:val="333333"/>
-          <w:sz w:val="20"/>
-          <w:szCs w:val="20"/>
-          <w:shd w:val="clear" w:color="auto" w:fill="FFFFFF"/>
-          <w:lang w:val="en-US"/>
-        </w:rPr>
-        <w:t>FEniCS</w:t>
-      </w:r>
-      <w:proofErr w:type="spellEnd"/>
+        <w:t xml:space="preserve">  - FEniCS</w:t>
+      </w:r>
     </w:p>
     <w:p>
       <w:pPr>
@@ -1515,23 +1400,8 @@
           <w:shd w:val="clear" w:color="auto" w:fill="FFFFFF"/>
           <w:lang w:val="en-US"/>
         </w:rPr>
-        <w:t xml:space="preserve">  - </w:t>
-      </w:r>
-      <w:proofErr w:type="spellStart"/>
-      <w:r>
-        <w:rPr>
-          <w:rFonts w:ascii="Times New Roman" w:hAnsi="Times New Roman" w:cs="Times New Roman"/>
-          <w:b/>
-          <w:bCs/>
-          <w:color w:val="333333"/>
-          <w:sz w:val="20"/>
-          <w:szCs w:val="20"/>
-          <w:shd w:val="clear" w:color="auto" w:fill="FFFFFF"/>
-          <w:lang w:val="en-US"/>
-        </w:rPr>
-        <w:t>Devito</w:t>
-      </w:r>
-      <w:proofErr w:type="spellEnd"/>
+        <w:t xml:space="preserve">  - Devito</w:t>
+      </w:r>
     </w:p>
     <w:p>
       <w:pPr>
@@ -3799,13 +3669,16 @@
         </w:rPr>
         <w:t xml:space="preserve"> </w:t>
       </w:r>
-    </w:p>
-    <w:p>
-      <w:pPr>
-        <w:rPr>
-          <w:lang w:val="en-US"/>
-        </w:rPr>
-      </w:pPr>
+      <w:r>
+        <w:rPr>
+          <w:rFonts w:ascii="Times New Roman" w:hAnsi="Times New Roman" w:cs="Times New Roman"/>
+          <w:color w:val="000000" w:themeColor="text1"/>
+          <w:sz w:val="21"/>
+          <w:szCs w:val="21"/>
+          <w:lang w:val="en-US"/>
+        </w:rPr>
+        <w:t xml:space="preserve">L2 norm of the difference between U-NO prediction and FDM ground truth, divided by the L2 norm of the ground truth. </w:t>
+      </w:r>
     </w:p>
     <w:sectPr>
       <w:pgSz w:w="12240" w:h="15840"/>

</xml_diff>